<commit_message>
Coche la case 1ère année dans les fiches du groupe GE 103
Co-Authored-By: Claude Opus 5.5 <noreply@anthropic.com>
Claude-Session: https://claude.ai/code/session_01EmmgnphWmEzPnz9h2FXthA
</commit_message>
<xml_diff>
--- a/Fiche_preparation_Circuit_RC_continu_GE103.docx
+++ b/Fiche_preparation_Circuit_RC_continu_GE103.docx
@@ -310,10 +310,18 @@
           <w:p>
             <w:pPr>
               <w:pStyle w:val="TableParagraph"/>
+              <w:jc w:val="center"/>
               <w:rPr>
                 <w:sz w:val="18"/>
               </w:rPr>
             </w:pPr>
+            <w:r>
+              <w:rPr>
+                <w:b/>
+                <w:sz w:val="22"/>
+              </w:rPr>
+              <w:t>X</w:t>
+            </w:r>
           </w:p>
         </w:tc>
         <w:tc>

</xml_diff>